<commit_message>
fix(relatorios): PDF do relatório MEI com células pretas e total errado
</commit_message>
<xml_diff>
--- a/assets/relatorios/RELATORIO_MENSAL_DAS_RECEITAS_BRUTAS_MEI.docx
+++ b/assets/relatorios/RELATORIO_MENSAL_DAS_RECEITAS_BRUTAS_MEI.docx
@@ -62,7 +62,7 @@
               <w:bottom w:val="single" w:sz="18" w:space="0" w:color="000000"/>
               <w:right w:val="single" w:sz="18" w:space="0" w:color="000000"/>
             </w:tcBorders>
-            <w:shd w:val="clear" w:color="auto" w:fill="auto"/>
+            <w:shd w:val="clear" w:color="auto" w:fill="FFFFFF"/>
           </w:tcPr>
           <w:p>
             <w:pPr>
@@ -99,7 +99,7 @@
               <w:bottom w:val="single" w:sz="18" w:space="0" w:color="000000"/>
               <w:right w:val="single" w:sz="18" w:space="0" w:color="000000"/>
             </w:tcBorders>
-            <w:shd w:val="clear" w:color="auto" w:fill="auto"/>
+            <w:shd w:val="clear" w:color="auto" w:fill="FFFFFF"/>
           </w:tcPr>
           <w:p>
             <w:pPr>
@@ -133,7 +133,7 @@
               <w:bottom w:val="single" w:sz="18" w:space="0" w:color="000000"/>
               <w:right w:val="single" w:sz="18" w:space="0" w:color="000000"/>
             </w:tcBorders>
-            <w:shd w:val="clear" w:color="auto" w:fill="auto"/>
+            <w:shd w:val="clear" w:color="auto" w:fill="FFFFFF"/>
           </w:tcPr>
           <w:p>
             <w:pPr>
@@ -191,7 +191,7 @@
               <w:left w:val="single" w:sz="18" w:space="0" w:color="000000"/>
               <w:bottom w:val="single" w:sz="18" w:space="0" w:color="000000"/>
             </w:tcBorders>
-            <w:shd w:val="clear" w:color="auto" w:fill="auto"/>
+            <w:shd w:val="clear" w:color="auto" w:fill="FFFFFF"/>
           </w:tcPr>
           <w:p>
             <w:pPr>
@@ -215,7 +215,7 @@
               <w:bottom w:val="single" w:sz="18" w:space="0" w:color="000000"/>
               <w:right w:val="single" w:sz="18" w:space="0" w:color="000000"/>
             </w:tcBorders>
-            <w:shd w:val="clear" w:color="auto" w:fill="auto"/>
+            <w:shd w:val="clear" w:color="auto" w:fill="FFFFFF"/>
           </w:tcPr>
           <w:p>
             <w:pPr>
@@ -257,7 +257,7 @@
               <w:left w:val="single" w:sz="18" w:space="0" w:color="000000"/>
               <w:bottom w:val="single" w:sz="18" w:space="0" w:color="000000"/>
             </w:tcBorders>
-            <w:shd w:val="clear" w:color="auto" w:fill="auto"/>
+            <w:shd w:val="clear" w:color="auto" w:fill="FFFFFF"/>
           </w:tcPr>
           <w:p>
             <w:pPr>
@@ -281,7 +281,7 @@
               <w:bottom w:val="single" w:sz="18" w:space="0" w:color="000000"/>
               <w:right w:val="single" w:sz="18" w:space="0" w:color="000000"/>
             </w:tcBorders>
-            <w:shd w:val="clear" w:color="auto" w:fill="auto"/>
+            <w:shd w:val="clear" w:color="auto" w:fill="FFFFFF"/>
           </w:tcPr>
           <w:p>
             <w:pPr>
@@ -316,7 +316,7 @@
               <w:left w:val="single" w:sz="18" w:space="0" w:color="000000"/>
               <w:bottom w:val="single" w:sz="18" w:space="0" w:color="000000"/>
             </w:tcBorders>
-            <w:shd w:val="clear" w:color="auto" w:fill="auto"/>
+            <w:shd w:val="clear" w:color="auto" w:fill="FFFFFF"/>
           </w:tcPr>
           <w:p>
             <w:pPr>
@@ -340,7 +340,7 @@
               <w:bottom w:val="single" w:sz="18" w:space="0" w:color="000000"/>
               <w:right w:val="single" w:sz="18" w:space="0" w:color="000000"/>
             </w:tcBorders>
-            <w:shd w:val="clear" w:color="auto" w:fill="auto"/>
+            <w:shd w:val="clear" w:color="auto" w:fill="FFFFFF"/>
           </w:tcPr>
           <w:p>
             <w:pPr>
@@ -401,7 +401,7 @@
               <w:left w:val="single" w:sz="18" w:space="0" w:color="000000"/>
               <w:bottom w:val="single" w:sz="18" w:space="0" w:color="000000"/>
             </w:tcBorders>
-            <w:shd w:val="clear" w:color="auto" w:fill="auto"/>
+            <w:shd w:val="clear" w:color="auto" w:fill="FFFFFF"/>
           </w:tcPr>
           <w:p>
             <w:pPr>
@@ -425,7 +425,7 @@
               <w:bottom w:val="single" w:sz="18" w:space="0" w:color="000000"/>
               <w:right w:val="single" w:sz="18" w:space="0" w:color="000000"/>
             </w:tcBorders>
-            <w:shd w:val="clear" w:color="auto" w:fill="auto"/>
+            <w:shd w:val="clear" w:color="auto" w:fill="FFFFFF"/>
           </w:tcPr>
           <w:p>
             <w:pPr>
@@ -474,7 +474,7 @@
               <w:left w:val="single" w:sz="18" w:space="0" w:color="000000"/>
               <w:bottom w:val="single" w:sz="18" w:space="0" w:color="000000"/>
             </w:tcBorders>
-            <w:shd w:val="clear" w:color="auto" w:fill="auto"/>
+            <w:shd w:val="clear" w:color="auto" w:fill="FFFFFF"/>
           </w:tcPr>
           <w:p>
             <w:pPr>
@@ -498,7 +498,7 @@
               <w:bottom w:val="single" w:sz="18" w:space="0" w:color="000000"/>
               <w:right w:val="single" w:sz="18" w:space="0" w:color="000000"/>
             </w:tcBorders>
-            <w:shd w:val="clear" w:color="auto" w:fill="auto"/>
+            <w:shd w:val="clear" w:color="auto" w:fill="FFFFFF"/>
           </w:tcPr>
           <w:p>
             <w:pPr>
@@ -547,7 +547,7 @@
               <w:left w:val="single" w:sz="18" w:space="0" w:color="000000"/>
               <w:bottom w:val="single" w:sz="18" w:space="0" w:color="000000"/>
             </w:tcBorders>
-            <w:shd w:val="clear" w:color="auto" w:fill="auto"/>
+            <w:shd w:val="clear" w:color="auto" w:fill="FFFFFF"/>
           </w:tcPr>
           <w:p>
             <w:pPr>
@@ -578,7 +578,7 @@
               <w:bottom w:val="single" w:sz="18" w:space="0" w:color="000000"/>
               <w:right w:val="single" w:sz="18" w:space="0" w:color="000000"/>
             </w:tcBorders>
-            <w:shd w:val="clear" w:color="auto" w:fill="auto"/>
+            <w:shd w:val="clear" w:color="auto" w:fill="FFFFFF"/>
           </w:tcPr>
           <w:p>
             <w:pPr>
@@ -650,7 +650,7 @@
               <w:left w:val="single" w:sz="18" w:space="0" w:color="000000"/>
               <w:bottom w:val="single" w:sz="18" w:space="0" w:color="000000"/>
             </w:tcBorders>
-            <w:shd w:val="clear" w:color="auto" w:fill="auto"/>
+            <w:shd w:val="clear" w:color="auto" w:fill="FFFFFF"/>
           </w:tcPr>
           <w:p>
             <w:pPr>
@@ -674,7 +674,7 @@
               <w:bottom w:val="single" w:sz="18" w:space="0" w:color="000000"/>
               <w:right w:val="single" w:sz="18" w:space="0" w:color="000000"/>
             </w:tcBorders>
-            <w:shd w:val="clear" w:color="auto" w:fill="auto"/>
+            <w:shd w:val="clear" w:color="auto" w:fill="FFFFFF"/>
           </w:tcPr>
           <w:p>
             <w:pPr>
@@ -723,7 +723,7 @@
               <w:left w:val="single" w:sz="18" w:space="0" w:color="000000"/>
               <w:bottom w:val="single" w:sz="18" w:space="0" w:color="000000"/>
             </w:tcBorders>
-            <w:shd w:val="clear" w:color="auto" w:fill="auto"/>
+            <w:shd w:val="clear" w:color="auto" w:fill="FFFFFF"/>
           </w:tcPr>
           <w:p>
             <w:pPr>
@@ -754,7 +754,7 @@
               <w:bottom w:val="single" w:sz="18" w:space="0" w:color="000000"/>
               <w:right w:val="single" w:sz="18" w:space="0" w:color="000000"/>
             </w:tcBorders>
-            <w:shd w:val="clear" w:color="auto" w:fill="auto"/>
+            <w:shd w:val="clear" w:color="auto" w:fill="FFFFFF"/>
           </w:tcPr>
           <w:p>
             <w:pPr>
@@ -803,7 +803,7 @@
               <w:left w:val="single" w:sz="18" w:space="0" w:color="000000"/>
               <w:bottom w:val="single" w:sz="18" w:space="0" w:color="000000"/>
             </w:tcBorders>
-            <w:shd w:val="clear" w:color="auto" w:fill="auto"/>
+            <w:shd w:val="clear" w:color="auto" w:fill="FFFFFF"/>
           </w:tcPr>
           <w:p>
             <w:pPr>
@@ -827,7 +827,7 @@
               <w:bottom w:val="single" w:sz="18" w:space="0" w:color="000000"/>
               <w:right w:val="single" w:sz="18" w:space="0" w:color="000000"/>
             </w:tcBorders>
-            <w:shd w:val="clear" w:color="auto" w:fill="auto"/>
+            <w:shd w:val="clear" w:color="auto" w:fill="FFFFFF"/>
           </w:tcPr>
           <w:p>
             <w:pPr>
@@ -873,7 +873,7 @@
               <w:left w:val="single" w:sz="18" w:space="0" w:color="000000"/>
               <w:bottom w:val="single" w:sz="18" w:space="0" w:color="000000"/>
             </w:tcBorders>
-            <w:shd w:val="clear" w:color="auto" w:fill="auto"/>
+            <w:shd w:val="clear" w:color="auto" w:fill="FFFFFF"/>
           </w:tcPr>
           <w:p>
             <w:pPr>
@@ -897,7 +897,7 @@
               <w:bottom w:val="single" w:sz="18" w:space="0" w:color="000000"/>
               <w:right w:val="single" w:sz="18" w:space="0" w:color="000000"/>
             </w:tcBorders>
-            <w:shd w:val="clear" w:color="auto" w:fill="auto"/>
+            <w:shd w:val="clear" w:color="auto" w:fill="FFFFFF"/>
           </w:tcPr>
           <w:p>
             <w:pPr>
@@ -937,7 +937,7 @@
               <w:left w:val="single" w:sz="18" w:space="0" w:color="000000"/>
               <w:bottom w:val="single" w:sz="18" w:space="0" w:color="000000"/>
             </w:tcBorders>
-            <w:shd w:val="clear" w:color="auto" w:fill="auto"/>
+            <w:shd w:val="clear" w:color="auto" w:fill="FFFFFF"/>
           </w:tcPr>
           <w:p>
             <w:pPr>
@@ -973,7 +973,7 @@
               <w:bottom w:val="single" w:sz="18" w:space="0" w:color="000000"/>
               <w:right w:val="single" w:sz="18" w:space="0" w:color="000000"/>
             </w:tcBorders>
-            <w:shd w:val="clear" w:color="auto" w:fill="auto"/>
+            <w:shd w:val="clear" w:color="auto" w:fill="FFFFFF"/>
           </w:tcPr>
           <w:p>
             <w:pPr>
@@ -1019,7 +1019,7 @@
               <w:bottom w:val="single" w:sz="18" w:space="0" w:color="000000"/>
               <w:right w:val="single" w:sz="18" w:space="0" w:color="000000"/>
             </w:tcBorders>
-            <w:shd w:val="clear" w:color="auto" w:fill="auto"/>
+            <w:shd w:val="clear" w:color="auto" w:fill="FFFFFF"/>
           </w:tcPr>
           <w:p>
             <w:r>

</xml_diff>

<commit_message>
fix(relatorios): PDF do relatório MEI com células pretas e total errado (#3010)
</commit_message>
<xml_diff>
--- a/assets/relatorios/RELATORIO_MENSAL_DAS_RECEITAS_BRUTAS_MEI.docx
+++ b/assets/relatorios/RELATORIO_MENSAL_DAS_RECEITAS_BRUTAS_MEI.docx
@@ -62,7 +62,7 @@
               <w:bottom w:val="single" w:sz="18" w:space="0" w:color="000000"/>
               <w:right w:val="single" w:sz="18" w:space="0" w:color="000000"/>
             </w:tcBorders>
-            <w:shd w:val="clear" w:color="auto" w:fill="auto"/>
+            <w:shd w:val="clear" w:color="auto" w:fill="FFFFFF"/>
           </w:tcPr>
           <w:p>
             <w:pPr>
@@ -99,7 +99,7 @@
               <w:bottom w:val="single" w:sz="18" w:space="0" w:color="000000"/>
               <w:right w:val="single" w:sz="18" w:space="0" w:color="000000"/>
             </w:tcBorders>
-            <w:shd w:val="clear" w:color="auto" w:fill="auto"/>
+            <w:shd w:val="clear" w:color="auto" w:fill="FFFFFF"/>
           </w:tcPr>
           <w:p>
             <w:pPr>
@@ -133,7 +133,7 @@
               <w:bottom w:val="single" w:sz="18" w:space="0" w:color="000000"/>
               <w:right w:val="single" w:sz="18" w:space="0" w:color="000000"/>
             </w:tcBorders>
-            <w:shd w:val="clear" w:color="auto" w:fill="auto"/>
+            <w:shd w:val="clear" w:color="auto" w:fill="FFFFFF"/>
           </w:tcPr>
           <w:p>
             <w:pPr>
@@ -191,7 +191,7 @@
               <w:left w:val="single" w:sz="18" w:space="0" w:color="000000"/>
               <w:bottom w:val="single" w:sz="18" w:space="0" w:color="000000"/>
             </w:tcBorders>
-            <w:shd w:val="clear" w:color="auto" w:fill="auto"/>
+            <w:shd w:val="clear" w:color="auto" w:fill="FFFFFF"/>
           </w:tcPr>
           <w:p>
             <w:pPr>
@@ -215,7 +215,7 @@
               <w:bottom w:val="single" w:sz="18" w:space="0" w:color="000000"/>
               <w:right w:val="single" w:sz="18" w:space="0" w:color="000000"/>
             </w:tcBorders>
-            <w:shd w:val="clear" w:color="auto" w:fill="auto"/>
+            <w:shd w:val="clear" w:color="auto" w:fill="FFFFFF"/>
           </w:tcPr>
           <w:p>
             <w:pPr>
@@ -257,7 +257,7 @@
               <w:left w:val="single" w:sz="18" w:space="0" w:color="000000"/>
               <w:bottom w:val="single" w:sz="18" w:space="0" w:color="000000"/>
             </w:tcBorders>
-            <w:shd w:val="clear" w:color="auto" w:fill="auto"/>
+            <w:shd w:val="clear" w:color="auto" w:fill="FFFFFF"/>
           </w:tcPr>
           <w:p>
             <w:pPr>
@@ -281,7 +281,7 @@
               <w:bottom w:val="single" w:sz="18" w:space="0" w:color="000000"/>
               <w:right w:val="single" w:sz="18" w:space="0" w:color="000000"/>
             </w:tcBorders>
-            <w:shd w:val="clear" w:color="auto" w:fill="auto"/>
+            <w:shd w:val="clear" w:color="auto" w:fill="FFFFFF"/>
           </w:tcPr>
           <w:p>
             <w:pPr>
@@ -316,7 +316,7 @@
               <w:left w:val="single" w:sz="18" w:space="0" w:color="000000"/>
               <w:bottom w:val="single" w:sz="18" w:space="0" w:color="000000"/>
             </w:tcBorders>
-            <w:shd w:val="clear" w:color="auto" w:fill="auto"/>
+            <w:shd w:val="clear" w:color="auto" w:fill="FFFFFF"/>
           </w:tcPr>
           <w:p>
             <w:pPr>
@@ -340,7 +340,7 @@
               <w:bottom w:val="single" w:sz="18" w:space="0" w:color="000000"/>
               <w:right w:val="single" w:sz="18" w:space="0" w:color="000000"/>
             </w:tcBorders>
-            <w:shd w:val="clear" w:color="auto" w:fill="auto"/>
+            <w:shd w:val="clear" w:color="auto" w:fill="FFFFFF"/>
           </w:tcPr>
           <w:p>
             <w:pPr>
@@ -401,7 +401,7 @@
               <w:left w:val="single" w:sz="18" w:space="0" w:color="000000"/>
               <w:bottom w:val="single" w:sz="18" w:space="0" w:color="000000"/>
             </w:tcBorders>
-            <w:shd w:val="clear" w:color="auto" w:fill="auto"/>
+            <w:shd w:val="clear" w:color="auto" w:fill="FFFFFF"/>
           </w:tcPr>
           <w:p>
             <w:pPr>
@@ -425,7 +425,7 @@
               <w:bottom w:val="single" w:sz="18" w:space="0" w:color="000000"/>
               <w:right w:val="single" w:sz="18" w:space="0" w:color="000000"/>
             </w:tcBorders>
-            <w:shd w:val="clear" w:color="auto" w:fill="auto"/>
+            <w:shd w:val="clear" w:color="auto" w:fill="FFFFFF"/>
           </w:tcPr>
           <w:p>
             <w:pPr>
@@ -474,7 +474,7 @@
               <w:left w:val="single" w:sz="18" w:space="0" w:color="000000"/>
               <w:bottom w:val="single" w:sz="18" w:space="0" w:color="000000"/>
             </w:tcBorders>
-            <w:shd w:val="clear" w:color="auto" w:fill="auto"/>
+            <w:shd w:val="clear" w:color="auto" w:fill="FFFFFF"/>
           </w:tcPr>
           <w:p>
             <w:pPr>
@@ -498,7 +498,7 @@
               <w:bottom w:val="single" w:sz="18" w:space="0" w:color="000000"/>
               <w:right w:val="single" w:sz="18" w:space="0" w:color="000000"/>
             </w:tcBorders>
-            <w:shd w:val="clear" w:color="auto" w:fill="auto"/>
+            <w:shd w:val="clear" w:color="auto" w:fill="FFFFFF"/>
           </w:tcPr>
           <w:p>
             <w:pPr>
@@ -547,7 +547,7 @@
               <w:left w:val="single" w:sz="18" w:space="0" w:color="000000"/>
               <w:bottom w:val="single" w:sz="18" w:space="0" w:color="000000"/>
             </w:tcBorders>
-            <w:shd w:val="clear" w:color="auto" w:fill="auto"/>
+            <w:shd w:val="clear" w:color="auto" w:fill="FFFFFF"/>
           </w:tcPr>
           <w:p>
             <w:pPr>
@@ -578,7 +578,7 @@
               <w:bottom w:val="single" w:sz="18" w:space="0" w:color="000000"/>
               <w:right w:val="single" w:sz="18" w:space="0" w:color="000000"/>
             </w:tcBorders>
-            <w:shd w:val="clear" w:color="auto" w:fill="auto"/>
+            <w:shd w:val="clear" w:color="auto" w:fill="FFFFFF"/>
           </w:tcPr>
           <w:p>
             <w:pPr>
@@ -650,7 +650,7 @@
               <w:left w:val="single" w:sz="18" w:space="0" w:color="000000"/>
               <w:bottom w:val="single" w:sz="18" w:space="0" w:color="000000"/>
             </w:tcBorders>
-            <w:shd w:val="clear" w:color="auto" w:fill="auto"/>
+            <w:shd w:val="clear" w:color="auto" w:fill="FFFFFF"/>
           </w:tcPr>
           <w:p>
             <w:pPr>
@@ -674,7 +674,7 @@
               <w:bottom w:val="single" w:sz="18" w:space="0" w:color="000000"/>
               <w:right w:val="single" w:sz="18" w:space="0" w:color="000000"/>
             </w:tcBorders>
-            <w:shd w:val="clear" w:color="auto" w:fill="auto"/>
+            <w:shd w:val="clear" w:color="auto" w:fill="FFFFFF"/>
           </w:tcPr>
           <w:p>
             <w:pPr>
@@ -723,7 +723,7 @@
               <w:left w:val="single" w:sz="18" w:space="0" w:color="000000"/>
               <w:bottom w:val="single" w:sz="18" w:space="0" w:color="000000"/>
             </w:tcBorders>
-            <w:shd w:val="clear" w:color="auto" w:fill="auto"/>
+            <w:shd w:val="clear" w:color="auto" w:fill="FFFFFF"/>
           </w:tcPr>
           <w:p>
             <w:pPr>
@@ -754,7 +754,7 @@
               <w:bottom w:val="single" w:sz="18" w:space="0" w:color="000000"/>
               <w:right w:val="single" w:sz="18" w:space="0" w:color="000000"/>
             </w:tcBorders>
-            <w:shd w:val="clear" w:color="auto" w:fill="auto"/>
+            <w:shd w:val="clear" w:color="auto" w:fill="FFFFFF"/>
           </w:tcPr>
           <w:p>
             <w:pPr>
@@ -803,7 +803,7 @@
               <w:left w:val="single" w:sz="18" w:space="0" w:color="000000"/>
               <w:bottom w:val="single" w:sz="18" w:space="0" w:color="000000"/>
             </w:tcBorders>
-            <w:shd w:val="clear" w:color="auto" w:fill="auto"/>
+            <w:shd w:val="clear" w:color="auto" w:fill="FFFFFF"/>
           </w:tcPr>
           <w:p>
             <w:pPr>
@@ -827,7 +827,7 @@
               <w:bottom w:val="single" w:sz="18" w:space="0" w:color="000000"/>
               <w:right w:val="single" w:sz="18" w:space="0" w:color="000000"/>
             </w:tcBorders>
-            <w:shd w:val="clear" w:color="auto" w:fill="auto"/>
+            <w:shd w:val="clear" w:color="auto" w:fill="FFFFFF"/>
           </w:tcPr>
           <w:p>
             <w:pPr>
@@ -873,7 +873,7 @@
               <w:left w:val="single" w:sz="18" w:space="0" w:color="000000"/>
               <w:bottom w:val="single" w:sz="18" w:space="0" w:color="000000"/>
             </w:tcBorders>
-            <w:shd w:val="clear" w:color="auto" w:fill="auto"/>
+            <w:shd w:val="clear" w:color="auto" w:fill="FFFFFF"/>
           </w:tcPr>
           <w:p>
             <w:pPr>
@@ -897,7 +897,7 @@
               <w:bottom w:val="single" w:sz="18" w:space="0" w:color="000000"/>
               <w:right w:val="single" w:sz="18" w:space="0" w:color="000000"/>
             </w:tcBorders>
-            <w:shd w:val="clear" w:color="auto" w:fill="auto"/>
+            <w:shd w:val="clear" w:color="auto" w:fill="FFFFFF"/>
           </w:tcPr>
           <w:p>
             <w:pPr>
@@ -937,7 +937,7 @@
               <w:left w:val="single" w:sz="18" w:space="0" w:color="000000"/>
               <w:bottom w:val="single" w:sz="18" w:space="0" w:color="000000"/>
             </w:tcBorders>
-            <w:shd w:val="clear" w:color="auto" w:fill="auto"/>
+            <w:shd w:val="clear" w:color="auto" w:fill="FFFFFF"/>
           </w:tcPr>
           <w:p>
             <w:pPr>
@@ -973,7 +973,7 @@
               <w:bottom w:val="single" w:sz="18" w:space="0" w:color="000000"/>
               <w:right w:val="single" w:sz="18" w:space="0" w:color="000000"/>
             </w:tcBorders>
-            <w:shd w:val="clear" w:color="auto" w:fill="auto"/>
+            <w:shd w:val="clear" w:color="auto" w:fill="FFFFFF"/>
           </w:tcPr>
           <w:p>
             <w:pPr>
@@ -1019,7 +1019,7 @@
               <w:bottom w:val="single" w:sz="18" w:space="0" w:color="000000"/>
               <w:right w:val="single" w:sz="18" w:space="0" w:color="000000"/>
             </w:tcBorders>
-            <w:shd w:val="clear" w:color="auto" w:fill="auto"/>
+            <w:shd w:val="clear" w:color="auto" w:fill="FFFFFF"/>
           </w:tcPr>
           <w:p>
             <w:r>

</xml_diff>